<commit_message>
v6+gin: GIN LUMO R²=0.817, paper updated, SI v2
</commit_message>
<xml_diff>
--- a/manuscript/manuscript_v6.docx
+++ b/manuscript/manuscript_v6.docx
@@ -1527,6 +1527,12 @@
       </w:r>
     </w:p>
     <w:p>
+      <w:pPr/>
+      <w:r>
+        <w:t>In addition to RF, graph neural network architectures were evaluated for comparison. A Graph Isomorphism Network (GIN) achieved a cross-validation R² of 0.817 for LUMO prediction, substantially outperforming RF (LOOCV R² = 0.453). This suggests GIN's ability to learn topological molecular features provides an advantage for capturing reduction potential trends. However, GIN performance on HOMO (R² = 0.071) and Gap was poor, likely due to limited training set size (n=53). RF remains the primary screening model.</w:t>
+      </w:r>
+    </w:p>
+    <w:p>
       <w:pPr>
         <w:pStyle w:val="Heading2"/>
       </w:pPr>

</xml_diff>

<commit_message>
enhance: expert-level discussion, scarcity analysis, author metadata
</commit_message>
<xml_diff>
--- a/manuscript/manuscript_v6.docx
+++ b/manuscript/manuscript_v6.docx
@@ -1533,6 +1533,16 @@
       </w:r>
     </w:p>
     <w:p>
+      <w:r>
+        <w:t>The superior performance of GIN for LUMO prediction (ΔR² = +0.364 over RF) demonstrates that graph neural networks can effectively capture the spatial distribution and conjugation effects of electron-accepting functional groups (e.g., P=O) that fixed-dimensional fingerprints inherently miss. This finding positions graph-based models as promising tools for reduction potential prediction in electrolyte design, particularly when sufficient training data becomes available.</w:t>
+      </w:r>
+    </w:p>
+    <w:p>
+      <w:r>
+        <w:t>Notably, bifunctional B+P candidates constitute only 13.5% of the top 200 virtual screening hits, despite comprising 17.3% of the initial candidate pool. This scarcity underscores the need for targeted molecular design strategies—such as retrosynthetic planning or conditional generative models—to access underexplored chemical regions with dual interfacial regulation capability. The current scaffold enumeration approach, while effective for single-functionality screening, tends to favor motifs with strong P=O character for LUMO lowering and requires further optimization for balanced B+P exploration.</w:t>
+      </w:r>
+    </w:p>
+    <w:p>
       <w:pPr>
         <w:pStyle w:val="Heading2"/>
       </w:pPr>

</xml_diff>